<commit_message>
Corrige redaccion del reporte de practica 03
</commit_message>
<xml_diff>
--- a/Reporte/R03-422022019.docx
+++ b/Reporte/R03-422022019.docx
@@ -2018,7 +2018,7 @@
         <w:pStyle w:val="ReporteCuerpo"/>
       </w:pPr>
       <w:r>
-        <w:t>Esta combinación no aparece literalmente en el código del profesor. La añadí para resolver la unión y la marqué como P12. Se implementó con glm::translate, glm::rotate y glm::scale, que ya se utilizaban en el ejemplo, sin crear clases o funciones de dibujo nuevas.</w:t>
+        <w:t>Para cerrar la unión apliqué glm::translate, glm::rotate y glm::scale en cada bloque de dibujo. Identifiqué este ajuste como P12. Con esta secuencia acomodé las ocho instancias de la misma malla y orienté sus puntas hacia el centro.</w:t>
       </w:r>
     </w:p>
     <w:p>
@@ -2167,7 +2167,7 @@
         <w:pStyle w:val="ReporteCuerpo"/>
       </w:pPr>
       <w:r>
-        <w:t>Revisar una figura por separado me ayudó a comprobar la base azul, que queda oculta al cerrar el rombo. También fue importante documentar la transformación añadida: aunque utilicé las mismas funciones del ejemplo, la combinación necesaria para inclinar las piezas no estaba resuelta en él.</w:t>
+        <w:t>La vista individual me ayudó a comprobar los cinco colores de la pirámide, sobre todo la base azul que queda oculta en la unión. Al girar el conjunto pude revisar cómo encajaban las piezas. Lo más importante fue cuidar el orden de las transformaciones para colocar cada instancia sin cambiar los vértices de la malla.</w:t>
       </w:r>
     </w:p>
     <w:p>

</xml_diff>

<commit_message>
Organiza entrega y documenta ajustes en comentarios del codigo
</commit_message>
<xml_diff>
--- a/Reporte/R03-422022019.docx
+++ b/Reporte/R03-422022019.docx
@@ -1235,7 +1235,7 @@
         <w:pStyle w:val="ReporteCuerpo"/>
       </w:pPr>
       <w:r>
-        <w:t>La pirámide de colores conserva las cinco posiciones y los seis triángulos de la pirámide cuadrangular del profesor. Repetí los vértices por cara para que cada triángulo tenga un RGB constante. Así, cada cara conserva un color uniforme, en lugar de interpolar colores distintos entre sus vértices. Utilicé MeshColor, que ya estaba incluida en Mesh.h.</w:t>
+        <w:t>La pirámide de colores conserva las cinco posiciones y los seis triángulos de la pirámide cuadrangular. Cada cara tiene un RGB constante para que su color sea uniforme. Utilicé MeshColor para almacenar posición y color en cada vértice. Esta malla se dibuja con glDrawArrays, que utiliza el número de vértices del arreglo (Khronos Group, s. f.).</w:t>
       </w:r>
     </w:p>
     <w:p>
@@ -1247,7 +1247,7 @@
       <w:r>
         <w:drawing>
           <wp:inline xmlns:a="http://schemas.openxmlformats.org/drawingml/2006/main">
-            <wp:extent cx="5577840" cy="1714610"/>
+            <wp:extent cx="5577840" cy="1576775"/>
             <wp:docPr id="5" name="Picture 5" descr="Figura 3. Posiciones originales repetidas por cara y color rojo de la primera cara."/>
             <wp:cNvGraphicFramePr>
               <a:graphicFrameLocks noChangeAspect="1"/>
@@ -1268,7 +1268,7 @@
                   <pic:spPr>
                     <a:xfrm>
                       <a:off x="0" y="0"/>
-                      <a:ext cx="5577840" cy="1714610"/>
+                      <a:ext cx="5577840" cy="1576775"/>
                     </a:xfrm>
                     <a:prstGeom prst="rect"/>
                   </pic:spPr>
@@ -2002,7 +2002,7 @@
         <w:pageBreakBefore/>
       </w:pPr>
       <w:r>
-        <w:t>1.4 Modificación para cerrar el rombo</w:t>
+        <w:t>2 Problemas encontrados y solución</w:t>
       </w:r>
     </w:p>
     <w:p>
@@ -2010,7 +2010,7 @@
         <w:pStyle w:val="ReporteCuerpo"/>
       </w:pPr>
       <w:r>
-        <w:t>Mover ocho pirámides rectas dejaba varias puntas separadas. Para que las cuatro de cada mitad llegaran a un mismo punto, añadí una combinación de giros y escala que inclina cada pirámide. La base conserva su forma cuadrada; la punta queda sobre una de sus esquinas. Por eso las instancias resultantes son pirámides oblicuas.</w:t>
+        <w:t>Lo más complicado fue unir las ocho pirámides. Al distribuirlas en dos niveles quedaban varias puntas separadas. Para cerrar la figura, incliné las piezas manteniendo sus bases cuadradas y acomodé cuatro arriba y cuatro abajo. Así, cada mitad comparte una sola punta. Tuve que cuidar el orden de las transformaciones, porque al cambiarlo también cambia la posición final de las piezas (GLM, s. f.).</w:t>
       </w:r>
     </w:p>
     <w:p>
@@ -2018,131 +2018,7 @@
         <w:pStyle w:val="ReporteCuerpo"/>
       </w:pPr>
       <w:r>
-        <w:t>Para cerrar la unión apliqué glm::translate, glm::rotate y glm::scale en cada bloque de dibujo. Identifiqué este ajuste como P12. Con esta secuencia acomodé las ocho instancias de la misma malla y orienté sus puntas hacia el centro.</w:t>
-      </w:r>
-    </w:p>
-    <w:p>
-      <w:pPr>
-        <w:keepNext/>
-        <w:spacing w:after="40"/>
-        <w:jc w:val="center"/>
-      </w:pPr>
-      <w:r>
-        <w:drawing>
-          <wp:inline xmlns:a="http://schemas.openxmlformats.org/drawingml/2006/main">
-            <wp:extent cx="5577840" cy="1863793"/>
-            <wp:docPr id="9" name="Picture 9" descr="Figura 6. Transformaciones de una de las cuatro pirámides superiores."/>
-            <wp:cNvGraphicFramePr>
-              <a:graphicFrameLocks noChangeAspect="1"/>
-            </wp:cNvGraphicFramePr>
-            <a:graphic>
-              <a:graphicData uri="http://schemas.openxmlformats.org/drawingml/2006/picture">
-                <pic:pic>
-                  <pic:nvPicPr>
-                    <pic:cNvPr id="0" name="codigo-inclinacion.png"/>
-                    <pic:cNvPicPr/>
-                  </pic:nvPicPr>
-                  <pic:blipFill>
-                    <a:blip r:embed="rId14"/>
-                    <a:stretch>
-                      <a:fillRect/>
-                    </a:stretch>
-                  </pic:blipFill>
-                  <pic:spPr>
-                    <a:xfrm>
-                      <a:off x="0" y="0"/>
-                      <a:ext cx="5577840" cy="1863793"/>
-                    </a:xfrm>
-                    <a:prstGeom prst="rect"/>
-                  </pic:spPr>
-                </pic:pic>
-              </a:graphicData>
-            </a:graphic>
-          </wp:inline>
-        </w:drawing>
-      </w:r>
-    </w:p>
-    <w:p>
-      <w:pPr>
-        <w:pStyle w:val="ReportePie"/>
-        <w:spacing w:after="160"/>
-        <w:jc w:val="center"/>
-      </w:pPr>
-      <w:r>
-        <w:t>Figura 6. Transformaciones de una de las cuatro pirámides superiores.</w:t>
-      </w:r>
-    </w:p>
-    <w:p>
-      <w:pPr>
-        <w:pStyle w:val="ReporteCuerpo"/>
-      </w:pPr>
-      <w:r>
-        <w:t>Los giros de -35.26438968° y 54.73561032°, junto con los factores de escala 1.41421356 y 0.70710678, producen una inclinación lateral, también llamada cizallamiento. Los valores corresponden a la raíz de 2, su inverso y el ángulo cuya tangente es 1 dividido entre la raíz de 2. Los giros alrededor de Y orientan esa inclinación hacia el centro de cada cuadrante.</w:t>
-      </w:r>
-    </w:p>
-    <w:p>
-      <w:pPr>
-        <w:pStyle w:val="ReporteCuerpo"/>
-      </w:pPr>
-      <w:r>
-        <w:t>La traslación (±0.25, 0.5, ±0.25) coloca las cuatro piezas superiores. Las otras cuatro repiten el mismo procedimiento y giran 180° alrededor de Z para formar la mitad inferior. En GLM, estas operaciones se multiplican sobre la matriz de entrada; cambiar su orden también cambia el resultado (GLM, s. f.).</w:t>
-      </w:r>
-    </w:p>
-    <w:p>
-      <w:pPr>
-        <w:pStyle w:val="ReporteCuerpo"/>
-      </w:pPr>
-      <w:r>
-        <w:t>Comprobé las coordenadas resultantes: las bases son cuadrados de lado 1 en Y = 0 y cada grupo comparte su punta. No hay ocho copias superpuestas del mismo volumen. Las cuatro piezas ocupan los cuatro cuadrantes de cada mitad. El arreglo original de posiciones de la pirámide no se modificó.</w:t>
-      </w:r>
-    </w:p>
-    <w:p>
-      <w:pPr>
-        <w:pStyle w:val="ReporteEncabezado"/>
-        <w:pageBreakBefore/>
-      </w:pPr>
-      <w:r>
-        <w:t>2 Problemas encontrados y solución</w:t>
-      </w:r>
-    </w:p>
-    <w:p>
-      <w:pPr>
-        <w:pStyle w:val="ReporteCuerpo"/>
-      </w:pPr>
-      <w:r>
-        <w:t>Unión de las pirámides. Corregí los huecos y las puntas separadas mediante la inclinación del apartado anterior, documentada como P12 en CAMBIOS.md.</w:t>
-      </w:r>
-    </w:p>
-    <w:p>
-      <w:pPr>
-        <w:pStyle w:val="ReporteCuerpo"/>
-      </w:pPr>
-      <w:r>
-        <w:t>Cantidad de vértices. MeshColor usaba la cantidad de componentes como número de vértices. Corregí vertexCount para dividir entre seis: tres componentes XYZ y tres RGB. Así, los 108 componentes de la pirámide corresponden a 18 vértices. glDrawArrays cuenta vértices, no valores float (Khronos Group, s. f.).</w:t>
-      </w:r>
-    </w:p>
-    <w:p>
-      <w:pPr>
-        <w:pStyle w:val="ReporteCuerpo"/>
-      </w:pPr>
-      <w:r>
-        <w:t>Cilindro y cono. Corregí los índices del cilindro, que recorrían componentes en lugar de vértices. En el cono quité un punto de cierre adicional y agregué la base. Ambos usan RenderMesh, GL_TRIANGLES, 48 sectores y radio 1; su tamaño final se ajusta con la escala.</w:t>
-      </w:r>
-    </w:p>
-    <w:p>
-      <w:pPr>
-        <w:pStyle w:val="ReporteCuerpo"/>
-      </w:pPr>
-      <w:r>
-        <w:t>Inicialización y shaders. Inicialicé los atributos pendientes de Window, añadí el retorno de Initialise y lo comprobé en el main. Comenté la validación del programa antes de enlazar un VAO, conservando las comprobaciones de compilación y enlace. Estos ajustes, junto con el conteo de vértices, están marcados como P04, P09, P10 y P11.</w:t>
-      </w:r>
-    </w:p>
-    <w:p>
-      <w:pPr>
-        <w:pStyle w:val="ReporteCuerpo"/>
-      </w:pPr>
-      <w:r>
-        <w:t>Otros ajustes. Añadí las teclas 1, 2 y 3, cambié el fondo y el título, y guardé las fuentes en UTF-8. Los shaders conservan su contenido original. La solución reúne los archivos en un proyecto de Visual Studio para Windows.</w:t>
+        <w:t>Otra dificultad fue revisar la base azul, ya que queda dentro del rombo y no se distingue en la vista del conjunto. La escena de una pirámide individual permite girarla y comprobar las cinco caras. En el cohete, la rotación también ayuda a distinguir las aletas, los soportes y la profundidad de la ventanilla.</w:t>
       </w:r>
     </w:p>
     <w:p>

</xml_diff>